<commit_message>
Documentos com infograficos e graficos; contagem de testes 217
</commit_message>
<xml_diff>
--- a/docs/Protege_Mais_EC_Atividade5_Relatorio_Final.docx
+++ b/docs/Protege_Mais_EC_Atividade5_Relatorio_Final.docx
@@ -1528,7 +1528,7 @@
                 <w:sz w:val="19"/>
                 <w:szCs w:val="19"/>
               </w:rPr>
-              <w:t xml:space="preserve">218 testes Java e 21 do contrato, sem falhas</w:t>
+              <w:t xml:space="preserve">217 testes Java e 21 do contrato, sem falhas</w:t>
             </w:r>
           </w:p>
         </w:tc>
@@ -1758,7 +1758,7 @@
           <w:sz w:val="18"/>
           <w:szCs w:val="18"/>
         </w:rPr>
-        <w:t xml:space="preserve">	7</w:t>
+        <w:t xml:space="preserve">	8</w:t>
       </w:r>
     </w:p>
     <w:p>
@@ -1947,7 +1947,7 @@
           <w:sz w:val="18"/>
           <w:szCs w:val="18"/>
         </w:rPr>
-        <w:t xml:space="preserve">	15</w:t>
+        <w:t xml:space="preserve">	16</w:t>
       </w:r>
     </w:p>
     <w:p>
@@ -1974,7 +1974,7 @@
           <w:sz w:val="18"/>
           <w:szCs w:val="18"/>
         </w:rPr>
-        <w:t xml:space="preserve">	16</w:t>
+        <w:t xml:space="preserve">	17</w:t>
       </w:r>
     </w:p>
     <w:p>
@@ -2001,7 +2001,7 @@
           <w:sz w:val="18"/>
           <w:szCs w:val="18"/>
         </w:rPr>
-        <w:t xml:space="preserve">	16</w:t>
+        <w:t xml:space="preserve">	17</w:t>
       </w:r>
     </w:p>
     <w:p>
@@ -2020,7 +2020,7 @@
           <w:sz w:val="18"/>
           <w:szCs w:val="18"/>
         </w:rPr>
-        <w:t xml:space="preserve">Impacto financeiro</w:t>
+        <w:t xml:space="preserve">Viabilidade</w:t>
       </w:r>
       <w:r>
         <w:rPr>
@@ -2028,7 +2028,7 @@
           <w:sz w:val="18"/>
           <w:szCs w:val="18"/>
         </w:rPr>
-        <w:t xml:space="preserve">	16</w:t>
+        <w:t xml:space="preserve">	17</w:t>
       </w:r>
     </w:p>
     <w:p>
@@ -2047,7 +2047,7 @@
           <w:sz w:val="18"/>
           <w:szCs w:val="18"/>
         </w:rPr>
-        <w:t xml:space="preserve">Viabilidade</w:t>
+        <w:t xml:space="preserve">Impacto financeiro</w:t>
       </w:r>
       <w:r>
         <w:rPr>
@@ -2055,7 +2055,7 @@
           <w:sz w:val="18"/>
           <w:szCs w:val="18"/>
         </w:rPr>
-        <w:t xml:space="preserve">	16</w:t>
+        <w:t xml:space="preserve">	17</w:t>
       </w:r>
     </w:p>
     <w:p>
@@ -2377,6 +2377,88 @@
       </w:r>
       <w:r>
         <w:t xml:space="preserve"> Cada frase vem com a evidência e a decisão sugerida. E, se um dia alguém tentar apagar o registro de que abriu o caso de Joana sem motivo, a blockchain vai acusar.</w:t>
+      </w:r>
+    </w:p>
+    <w:p>
+      <w:pPr>
+        <w:keepNext/>
+        <w:spacing w:before="120" w:after="60"/>
+        <w:jc w:val="center"/>
+      </w:pPr>
+      <w:r>
+        <w:drawing>
+          <wp:inline distT="0" distB="0" distL="0" distR="0">
+            <wp:extent cx="5943600" cy="1876425"/>
+            <wp:effectExtent t="0" r="0" b="0" l="0"/>
+            <wp:docPr id="1" name="fig1" descr="A jornada de Joana, do registro à decisão do gestor." title="A jornada de Joana, do registro à decisão do gestor."/>
+            <wp:cNvGraphicFramePr>
+              <a:graphicFrameLocks xmlns:a="http://schemas.openxmlformats.org/drawingml/2006/main" noChangeAspect="1"/>
+            </wp:cNvGraphicFramePr>
+            <a:graphic xmlns:a="http://schemas.openxmlformats.org/drawingml/2006/main">
+              <a:graphicData uri="http://schemas.openxmlformats.org/drawingml/2006/picture">
+                <pic:pic xmlns:pic="http://schemas.openxmlformats.org/drawingml/2006/picture">
+                  <pic:nvPicPr>
+                    <pic:cNvPr id="0" name="" descr=""/>
+                    <pic:cNvPicPr>
+                      <a:picLocks noChangeAspect="1" noChangeArrowheads="1"/>
+                    </pic:cNvPicPr>
+                  </pic:nvPicPr>
+                  <pic:blipFill>
+                    <a:blip r:embed="rId8" cstate="none"/>
+                    <a:srcRect/>
+                    <a:stretch>
+                      <a:fillRect/>
+                    </a:stretch>
+                  </pic:blipFill>
+                  <pic:spPr bwMode="auto">
+                    <a:xfrm>
+                      <a:off x="0" y="0"/>
+                      <a:ext cx="5943600" cy="1876425"/>
+                    </a:xfrm>
+                    <a:prstGeom prst="rect">
+                      <a:avLst/>
+                    </a:prstGeom>
+                  </pic:spPr>
+                </pic:pic>
+              </a:graphicData>
+            </a:graphic>
+          </wp:inline>
+        </w:drawing>
+      </w:r>
+    </w:p>
+    <w:p>
+      <w:pPr>
+        <w:spacing w:after="200"/>
+        <w:jc w:val="center"/>
+      </w:pPr>
+      <w:r>
+        <w:rPr>
+          <w:color w:val="1A4DA0"/>
+          <w:sz w:val="14"/>
+          <w:szCs w:val="14"/>
+          <w:rFonts w:ascii="Segoe UI Symbol" w:cs="Segoe UI Symbol" w:eastAsia="Segoe UI Symbol" w:hAnsi="Segoe UI Symbol"/>
+        </w:rPr>
+        <w:t xml:space="preserve">▲ </w:t>
+      </w:r>
+      <w:r>
+        <w:rPr>
+          <w:b/>
+          <w:bCs/>
+          <w:color w:val="1A4DA0"/>
+          <w:sz w:val="18"/>
+          <w:szCs w:val="18"/>
+        </w:rPr>
+        <w:t xml:space="preserve">Figura 1. </w:t>
+      </w:r>
+      <w:r>
+        <w:rPr>
+          <w:i/>
+          <w:iCs/>
+          <w:color w:val="475569"/>
+          <w:sz w:val="18"/>
+          <w:szCs w:val="18"/>
+        </w:rPr>
+        <w:t xml:space="preserve">A jornada de Joana, do registro à decisão do gestor.</w:t>
       </w:r>
     </w:p>
     <w:p>
@@ -5066,6 +5148,88 @@
     <w:p>
       <w:pPr>
         <w:keepNext/>
+        <w:spacing w:before="120" w:after="60"/>
+        <w:jc w:val="center"/>
+      </w:pPr>
+      <w:r>
+        <w:drawing>
+          <wp:inline distT="0" distB="0" distL="0" distR="0">
+            <wp:extent cx="5943600" cy="2190750"/>
+            <wp:effectExtent t="0" r="0" b="0" l="0"/>
+            <wp:docPr id="1" name="fig2" descr="As entregas do HackGov e do Enterprise Challenge ao longo de 2026." title="As entregas do HackGov e do Enterprise Challenge ao longo de 2026."/>
+            <wp:cNvGraphicFramePr>
+              <a:graphicFrameLocks xmlns:a="http://schemas.openxmlformats.org/drawingml/2006/main" noChangeAspect="1"/>
+            </wp:cNvGraphicFramePr>
+            <a:graphic xmlns:a="http://schemas.openxmlformats.org/drawingml/2006/main">
+              <a:graphicData uri="http://schemas.openxmlformats.org/drawingml/2006/picture">
+                <pic:pic xmlns:pic="http://schemas.openxmlformats.org/drawingml/2006/picture">
+                  <pic:nvPicPr>
+                    <pic:cNvPr id="0" name="" descr=""/>
+                    <pic:cNvPicPr>
+                      <a:picLocks noChangeAspect="1" noChangeArrowheads="1"/>
+                    </pic:cNvPicPr>
+                  </pic:nvPicPr>
+                  <pic:blipFill>
+                    <a:blip r:embed="rId9" cstate="none"/>
+                    <a:srcRect/>
+                    <a:stretch>
+                      <a:fillRect/>
+                    </a:stretch>
+                  </pic:blipFill>
+                  <pic:spPr bwMode="auto">
+                    <a:xfrm>
+                      <a:off x="0" y="0"/>
+                      <a:ext cx="5943600" cy="2190750"/>
+                    </a:xfrm>
+                    <a:prstGeom prst="rect">
+                      <a:avLst/>
+                    </a:prstGeom>
+                  </pic:spPr>
+                </pic:pic>
+              </a:graphicData>
+            </a:graphic>
+          </wp:inline>
+        </w:drawing>
+      </w:r>
+    </w:p>
+    <w:p>
+      <w:pPr>
+        <w:spacing w:after="200"/>
+        <w:jc w:val="center"/>
+      </w:pPr>
+      <w:r>
+        <w:rPr>
+          <w:color w:val="0E7C8C"/>
+          <w:sz w:val="14"/>
+          <w:szCs w:val="14"/>
+          <w:rFonts w:ascii="Segoe UI Symbol" w:cs="Segoe UI Symbol" w:eastAsia="Segoe UI Symbol" w:hAnsi="Segoe UI Symbol"/>
+        </w:rPr>
+        <w:t xml:space="preserve">▲ </w:t>
+      </w:r>
+      <w:r>
+        <w:rPr>
+          <w:b/>
+          <w:bCs/>
+          <w:color w:val="0E7C8C"/>
+          <w:sz w:val="18"/>
+          <w:szCs w:val="18"/>
+        </w:rPr>
+        <w:t xml:space="preserve">Figura 2. </w:t>
+      </w:r>
+      <w:r>
+        <w:rPr>
+          <w:i/>
+          <w:iCs/>
+          <w:color w:val="475569"/>
+          <w:sz w:val="18"/>
+          <w:szCs w:val="18"/>
+        </w:rPr>
+        <w:t xml:space="preserve">As entregas do HackGov e do Enterprise Challenge ao longo de 2026.</w:t>
+      </w:r>
+    </w:p>
+    <w:p>
+      <w:pPr>
+        <w:keepNext/>
         <w:spacing w:before="160" w:after="80"/>
       </w:pPr>
       <w:r>
@@ -7509,7 +7673,7 @@
                 <w:sz w:val="17"/>
                 <w:szCs w:val="17"/>
               </w:rPr>
-              <w:t xml:space="preserve">218 + 21 testes e verificações de ponta a ponta</w:t>
+              <w:t xml:space="preserve">217 + 21 testes e verificações de ponta a ponta</w:t>
             </w:r>
           </w:p>
         </w:tc>
@@ -9345,7 +9509,7 @@
           <wp:inline distT="0" distB="0" distL="0" distR="0">
             <wp:extent cx="6296025" cy="3609975"/>
             <wp:effectExtent t="0" r="0" b="0" l="0"/>
-            <wp:docPr id="1" name="fig1" descr="Diagrama funcional: canais, borda de rede, módulos da API, banco e serviços externos." title="Diagrama funcional: canais, borda de rede, módulos da API, banco e serviços externos."/>
+            <wp:docPr id="1" name="fig3" descr="Diagrama funcional: canais, borda de rede, módulos da API, banco e serviços externos." title="Diagrama funcional: canais, borda de rede, módulos da API, banco e serviços externos."/>
             <wp:cNvGraphicFramePr>
               <a:graphicFrameLocks xmlns:a="http://schemas.openxmlformats.org/drawingml/2006/main" noChangeAspect="1"/>
             </wp:cNvGraphicFramePr>
@@ -9359,7 +9523,7 @@
                     </pic:cNvPicPr>
                   </pic:nvPicPr>
                   <pic:blipFill>
-                    <a:blip r:embed="rId8" cstate="none"/>
+                    <a:blip r:embed="rId10" cstate="none"/>
                     <a:srcRect/>
                     <a:stretch>
                       <a:fillRect/>
@@ -9403,7 +9567,7 @@
           <w:sz w:val="18"/>
           <w:szCs w:val="18"/>
         </w:rPr>
-        <w:t xml:space="preserve">Figura 1. </w:t>
+        <w:t xml:space="preserve">Figura 3. </w:t>
       </w:r>
       <w:r>
         <w:rPr>
@@ -9427,7 +9591,7 @@
           <wp:inline distT="0" distB="0" distL="0" distR="0">
             <wp:extent cx="5038725" cy="4029075"/>
             <wp:effectExtent t="0" r="0" b="0" l="0"/>
-            <wp:docPr id="1" name="fig2" descr="Casos de uso e atores. A rotina de ancoragem é um ator de sistema." title="Casos de uso e atores. A rotina de ancoragem é um ator de sistema."/>
+            <wp:docPr id="1" name="fig4" descr="Casos de uso e atores. A rotina de ancoragem é um ator de sistema." title="Casos de uso e atores. A rotina de ancoragem é um ator de sistema."/>
             <wp:cNvGraphicFramePr>
               <a:graphicFrameLocks xmlns:a="http://schemas.openxmlformats.org/drawingml/2006/main" noChangeAspect="1"/>
             </wp:cNvGraphicFramePr>
@@ -9441,7 +9605,7 @@
                     </pic:cNvPicPr>
                   </pic:nvPicPr>
                   <pic:blipFill>
-                    <a:blip r:embed="rId9" cstate="none"/>
+                    <a:blip r:embed="rId11" cstate="none"/>
                     <a:srcRect/>
                     <a:stretch>
                       <a:fillRect/>
@@ -9485,7 +9649,7 @@
           <w:sz w:val="18"/>
           <w:szCs w:val="18"/>
         </w:rPr>
-        <w:t xml:space="preserve">Figura 2. </w:t>
+        <w:t xml:space="preserve">Figura 4. </w:t>
       </w:r>
       <w:r>
         <w:rPr>
@@ -12858,7 +13022,7 @@
                 <w:sz w:val="17"/>
                 <w:szCs w:val="17"/>
               </w:rPr>
-              <w:t xml:space="preserve">218 testes Java, testes de navegador e de regressão</w:t>
+              <w:t xml:space="preserve">217 testes Java, testes de navegador e de regressão</w:t>
             </w:r>
           </w:p>
         </w:tc>
@@ -15773,6 +15937,88 @@
         <w:spacing w:after="160" w:line="120"/>
       </w:pPr>
     </w:p>
+    <w:p>
+      <w:pPr>
+        <w:keepNext/>
+        <w:spacing w:before="120" w:after="60"/>
+        <w:jc w:val="center"/>
+      </w:pPr>
+      <w:r>
+        <w:drawing>
+          <wp:inline distT="0" distB="0" distL="0" distR="0">
+            <wp:extent cx="5943600" cy="3057525"/>
+            <wp:effectExtent t="0" r="0" b="0" l="0"/>
+            <wp:docPr id="1" name="fig5" descr="Custo de desenvolvimento por papel, do maior para o menor. O back-end Java concentra um terço do total." title="Custo de desenvolvimento por papel, do maior para o menor. O back-end Java concentra um terço do total."/>
+            <wp:cNvGraphicFramePr>
+              <a:graphicFrameLocks xmlns:a="http://schemas.openxmlformats.org/drawingml/2006/main" noChangeAspect="1"/>
+            </wp:cNvGraphicFramePr>
+            <a:graphic xmlns:a="http://schemas.openxmlformats.org/drawingml/2006/main">
+              <a:graphicData uri="http://schemas.openxmlformats.org/drawingml/2006/picture">
+                <pic:pic xmlns:pic="http://schemas.openxmlformats.org/drawingml/2006/picture">
+                  <pic:nvPicPr>
+                    <pic:cNvPr id="0" name="" descr=""/>
+                    <pic:cNvPicPr>
+                      <a:picLocks noChangeAspect="1" noChangeArrowheads="1"/>
+                    </pic:cNvPicPr>
+                  </pic:nvPicPr>
+                  <pic:blipFill>
+                    <a:blip r:embed="rId12" cstate="none"/>
+                    <a:srcRect/>
+                    <a:stretch>
+                      <a:fillRect/>
+                    </a:stretch>
+                  </pic:blipFill>
+                  <pic:spPr bwMode="auto">
+                    <a:xfrm>
+                      <a:off x="0" y="0"/>
+                      <a:ext cx="5943600" cy="3057525"/>
+                    </a:xfrm>
+                    <a:prstGeom prst="rect">
+                      <a:avLst/>
+                    </a:prstGeom>
+                  </pic:spPr>
+                </pic:pic>
+              </a:graphicData>
+            </a:graphic>
+          </wp:inline>
+        </w:drawing>
+      </w:r>
+    </w:p>
+    <w:p>
+      <w:pPr>
+        <w:spacing w:after="200"/>
+        <w:jc w:val="center"/>
+      </w:pPr>
+      <w:r>
+        <w:rPr>
+          <w:color w:val="D27500"/>
+          <w:sz w:val="14"/>
+          <w:szCs w:val="14"/>
+          <w:rFonts w:ascii="Segoe UI Symbol" w:cs="Segoe UI Symbol" w:eastAsia="Segoe UI Symbol" w:hAnsi="Segoe UI Symbol"/>
+        </w:rPr>
+        <w:t xml:space="preserve">▲ </w:t>
+      </w:r>
+      <w:r>
+        <w:rPr>
+          <w:b/>
+          <w:bCs/>
+          <w:color w:val="D27500"/>
+          <w:sz w:val="18"/>
+          <w:szCs w:val="18"/>
+        </w:rPr>
+        <w:t xml:space="preserve">Figura 5. </w:t>
+      </w:r>
+      <w:r>
+        <w:rPr>
+          <w:i/>
+          <w:iCs/>
+          <w:color w:val="475569"/>
+          <w:sz w:val="18"/>
+          <w:szCs w:val="18"/>
+        </w:rPr>
+        <w:t xml:space="preserve">Custo de desenvolvimento por papel, do maior para o menor. O back-end Java concentra um terço do total.</w:t>
+      </w:r>
+    </w:p>
     <w:tbl>
       <w:tblPr>
         <w:tblW w:type="dxa" w:w="9638"/>
@@ -17324,6 +17570,88 @@
     </w:p>
     <w:p>
       <w:pPr>
+        <w:keepNext/>
+        <w:spacing w:before="120" w:after="60"/>
+        <w:jc w:val="center"/>
+      </w:pPr>
+      <w:r>
+        <w:drawing>
+          <wp:inline distT="0" distB="0" distL="0" distR="0">
+            <wp:extent cx="5943600" cy="2381250"/>
+            <wp:effectExtent t="0" r="0" b="0" l="0"/>
+            <wp:docPr id="1" name="fig6" descr="Faixa mensal de cada item de operação. Banco com réplica e duas instâncias da API são os custos fixos." title="Faixa mensal de cada item de operação. Banco com réplica e duas instâncias da API são os custos fixos."/>
+            <wp:cNvGraphicFramePr>
+              <a:graphicFrameLocks xmlns:a="http://schemas.openxmlformats.org/drawingml/2006/main" noChangeAspect="1"/>
+            </wp:cNvGraphicFramePr>
+            <a:graphic xmlns:a="http://schemas.openxmlformats.org/drawingml/2006/main">
+              <a:graphicData uri="http://schemas.openxmlformats.org/drawingml/2006/picture">
+                <pic:pic xmlns:pic="http://schemas.openxmlformats.org/drawingml/2006/picture">
+                  <pic:nvPicPr>
+                    <pic:cNvPr id="0" name="" descr=""/>
+                    <pic:cNvPicPr>
+                      <a:picLocks noChangeAspect="1" noChangeArrowheads="1"/>
+                    </pic:cNvPicPr>
+                  </pic:nvPicPr>
+                  <pic:blipFill>
+                    <a:blip r:embed="rId13" cstate="none"/>
+                    <a:srcRect/>
+                    <a:stretch>
+                      <a:fillRect/>
+                    </a:stretch>
+                  </pic:blipFill>
+                  <pic:spPr bwMode="auto">
+                    <a:xfrm>
+                      <a:off x="0" y="0"/>
+                      <a:ext cx="5943600" cy="2381250"/>
+                    </a:xfrm>
+                    <a:prstGeom prst="rect">
+                      <a:avLst/>
+                    </a:prstGeom>
+                  </pic:spPr>
+                </pic:pic>
+              </a:graphicData>
+            </a:graphic>
+          </wp:inline>
+        </w:drawing>
+      </w:r>
+    </w:p>
+    <w:p>
+      <w:pPr>
+        <w:spacing w:after="200"/>
+        <w:jc w:val="center"/>
+      </w:pPr>
+      <w:r>
+        <w:rPr>
+          <w:color w:val="D27500"/>
+          <w:sz w:val="14"/>
+          <w:szCs w:val="14"/>
+          <w:rFonts w:ascii="Segoe UI Symbol" w:cs="Segoe UI Symbol" w:eastAsia="Segoe UI Symbol" w:hAnsi="Segoe UI Symbol"/>
+        </w:rPr>
+        <w:t xml:space="preserve">▲ </w:t>
+      </w:r>
+      <w:r>
+        <w:rPr>
+          <w:b/>
+          <w:bCs/>
+          <w:color w:val="D27500"/>
+          <w:sz w:val="18"/>
+          <w:szCs w:val="18"/>
+        </w:rPr>
+        <w:t xml:space="preserve">Figura 6. </w:t>
+      </w:r>
+      <w:r>
+        <w:rPr>
+          <w:i/>
+          <w:iCs/>
+          <w:color w:val="475569"/>
+          <w:sz w:val="18"/>
+          <w:szCs w:val="18"/>
+        </w:rPr>
+        <w:t xml:space="preserve">Faixa mensal de cada item de operação. Banco com réplica e duas instâncias da API são os custos fixos.</w:t>
+      </w:r>
+    </w:p>
+    <w:p>
+      <w:pPr>
         <w:pStyle w:val="Heading1"/>
         <w:keepNext/>
         <w:pageBreakBefore/>
@@ -18157,6 +18485,112 @@
         <w:rPr>
           <w:color w:val="0D2E6E"/>
         </w:rPr>
+        <w:t xml:space="preserve">Viabilidade</w:t>
+      </w:r>
+    </w:p>
+    <w:p>
+      <w:pPr>
+        <w:keepNext/>
+        <w:spacing w:before="120" w:after="60"/>
+        <w:jc w:val="center"/>
+      </w:pPr>
+      <w:r>
+        <w:drawing>
+          <wp:inline distT="0" distB="0" distL="0" distR="0">
+            <wp:extent cx="5219700" cy="1390650"/>
+            <wp:effectExtent t="0" r="0" b="0" l="0"/>
+            <wp:docPr id="1" name="fig7" descr="Viabilidade por dimensão. As duas que dependem de outros não se resolvem com código." title="Viabilidade por dimensão. As duas que dependem de outros não se resolvem com código."/>
+            <wp:cNvGraphicFramePr>
+              <a:graphicFrameLocks xmlns:a="http://schemas.openxmlformats.org/drawingml/2006/main" noChangeAspect="1"/>
+            </wp:cNvGraphicFramePr>
+            <a:graphic xmlns:a="http://schemas.openxmlformats.org/drawingml/2006/main">
+              <a:graphicData uri="http://schemas.openxmlformats.org/drawingml/2006/picture">
+                <pic:pic xmlns:pic="http://schemas.openxmlformats.org/drawingml/2006/picture">
+                  <pic:nvPicPr>
+                    <pic:cNvPr id="0" name="" descr=""/>
+                    <pic:cNvPicPr>
+                      <a:picLocks noChangeAspect="1" noChangeArrowheads="1"/>
+                    </pic:cNvPicPr>
+                  </pic:nvPicPr>
+                  <pic:blipFill>
+                    <a:blip r:embed="rId14" cstate="none"/>
+                    <a:srcRect/>
+                    <a:stretch>
+                      <a:fillRect/>
+                    </a:stretch>
+                  </pic:blipFill>
+                  <pic:spPr bwMode="auto">
+                    <a:xfrm>
+                      <a:off x="0" y="0"/>
+                      <a:ext cx="5219700" cy="1390650"/>
+                    </a:xfrm>
+                    <a:prstGeom prst="rect">
+                      <a:avLst/>
+                    </a:prstGeom>
+                  </pic:spPr>
+                </pic:pic>
+              </a:graphicData>
+            </a:graphic>
+          </wp:inline>
+        </w:drawing>
+      </w:r>
+    </w:p>
+    <w:p>
+      <w:pPr>
+        <w:spacing w:after="200"/>
+        <w:jc w:val="center"/>
+      </w:pPr>
+      <w:r>
+        <w:rPr>
+          <w:color w:val="1A4DA0"/>
+          <w:sz w:val="14"/>
+          <w:szCs w:val="14"/>
+          <w:rFonts w:ascii="Segoe UI Symbol" w:cs="Segoe UI Symbol" w:eastAsia="Segoe UI Symbol" w:hAnsi="Segoe UI Symbol"/>
+        </w:rPr>
+        <w:t xml:space="preserve">▲ </w:t>
+      </w:r>
+      <w:r>
+        <w:rPr>
+          <w:b/>
+          <w:bCs/>
+          <w:color w:val="1A4DA0"/>
+          <w:sz w:val="18"/>
+          <w:szCs w:val="18"/>
+        </w:rPr>
+        <w:t xml:space="preserve">Figura 7. </w:t>
+      </w:r>
+      <w:r>
+        <w:rPr>
+          <w:i/>
+          <w:iCs/>
+          <w:color w:val="475569"/>
+          <w:sz w:val="18"/>
+          <w:szCs w:val="18"/>
+        </w:rPr>
+        <w:t xml:space="preserve">Viabilidade por dimensão. As duas que dependem de outros não se resolvem com código.</w:t>
+      </w:r>
+    </w:p>
+    <w:p>
+      <w:pPr>
+        <w:pStyle w:val="Heading2"/>
+        <w:keepNext/>
+        <w:pBdr>
+          <w:bottom w:val="single" w:color="C9D7EF" w:sz="6" w:space="3"/>
+        </w:pBdr>
+      </w:pPr>
+      <w:r>
+        <w:rPr>
+          <w:color w:val="1A4DA0"/>
+          <w:sz w:val="22"/>
+          <w:szCs w:val="22"/>
+          <w:rFonts w:ascii="Segoe UI Symbol" w:cs="Segoe UI Symbol" w:eastAsia="Segoe UI Symbol" w:hAnsi="Segoe UI Symbol"/>
+        </w:rPr>
+        <w:t xml:space="preserve">■ </w:t>
+      </w:r>
+      <w:r>
+        <w:rPr>
+          <w:color w:val="0D2E6E"/>
+        </w:rPr>
         <w:t xml:space="preserve">Impacto financeiro</w:t>
       </w:r>
     </w:p>
@@ -18263,524 +18697,6 @@
       <w:r>
         <w:t xml:space="preserve"> mais importante não aparece em planilha: um vazamento de dados de vítimas de violência teria custo humano, jurídico (LGPD) e de reputação muito maior que o do projeto inteiro.</w:t>
       </w:r>
-    </w:p>
-    <w:p>
-      <w:pPr>
-        <w:pStyle w:val="Heading2"/>
-        <w:keepNext/>
-        <w:pBdr>
-          <w:bottom w:val="single" w:color="C9D7EF" w:sz="6" w:space="3"/>
-        </w:pBdr>
-      </w:pPr>
-      <w:r>
-        <w:rPr>
-          <w:color w:val="1A4DA0"/>
-          <w:sz w:val="22"/>
-          <w:szCs w:val="22"/>
-          <w:rFonts w:ascii="Segoe UI Symbol" w:cs="Segoe UI Symbol" w:eastAsia="Segoe UI Symbol" w:hAnsi="Segoe UI Symbol"/>
-        </w:rPr>
-        <w:t xml:space="preserve">■ </w:t>
-      </w:r>
-      <w:r>
-        <w:rPr>
-          <w:color w:val="0D2E6E"/>
-        </w:rPr>
-        <w:t xml:space="preserve">Viabilidade</w:t>
-      </w:r>
-    </w:p>
-    <w:tbl>
-      <w:tblPr>
-        <w:tblW w:type="dxa" w:w="9638"/>
-        <w:tblBorders>
-          <w:top w:val="single" w:color="auto" w:sz="4"/>
-          <w:left w:val="single" w:color="auto" w:sz="4"/>
-          <w:bottom w:val="single" w:color="auto" w:sz="4"/>
-          <w:right w:val="single" w:color="auto" w:sz="4"/>
-          <w:insideH w:val="single" w:color="auto" w:sz="4"/>
-          <w:insideV w:val="single" w:color="auto" w:sz="4"/>
-        </w:tblBorders>
-      </w:tblPr>
-      <w:tblGrid>
-        <w:gridCol w:w="1734"/>
-        <w:gridCol w:w="7904"/>
-      </w:tblGrid>
-      <w:tr>
-        <w:trPr>
-          <w:cantSplit/>
-          <w:tblHeader/>
-        </w:trPr>
-        <w:tc>
-          <w:tcPr>
-            <w:tcW w:type="dxa" w:w="1734"/>
-            <w:tcBorders>
-              <w:top w:val="single" w:color="D5DDE8" w:sz="4"/>
-              <w:left w:val="single" w:color="D5DDE8" w:sz="4"/>
-              <w:bottom w:val="single" w:color="D5DDE8" w:sz="4"/>
-              <w:right w:val="single" w:color="D5DDE8" w:sz="4"/>
-            </w:tcBorders>
-            <w:shd w:fill="1A4DA0" w:color="auto" w:val="clear"/>
-            <w:tcMar>
-              <w:top w:type="dxa" w:w="70"/>
-              <w:left w:type="dxa" w:w="110"/>
-              <w:bottom w:type="dxa" w:w="70"/>
-              <w:right w:type="dxa" w:w="110"/>
-            </w:tcMar>
-          </w:tcPr>
-          <w:p>
-            <w:pPr>
-              <w:keepNext/>
-              <w:keepLines/>
-              <w:spacing w:after="40" w:line="252"/>
-              <w:jc w:val="left"/>
-            </w:pPr>
-            <w:r>
-              <w:rPr>
-                <w:b/>
-                <w:bCs/>
-                <w:color w:val="FFFFFF"/>
-                <w:sz w:val="18"/>
-                <w:szCs w:val="18"/>
-              </w:rPr>
-              <w:t xml:space="preserve">Dimensão</w:t>
-            </w:r>
-          </w:p>
-        </w:tc>
-        <w:tc>
-          <w:tcPr>
-            <w:tcW w:type="dxa" w:w="7904"/>
-            <w:tcBorders>
-              <w:top w:val="single" w:color="D5DDE8" w:sz="4"/>
-              <w:left w:val="single" w:color="D5DDE8" w:sz="4"/>
-              <w:bottom w:val="single" w:color="D5DDE8" w:sz="4"/>
-              <w:right w:val="single" w:color="D5DDE8" w:sz="4"/>
-            </w:tcBorders>
-            <w:shd w:fill="1A4DA0" w:color="auto" w:val="clear"/>
-            <w:tcMar>
-              <w:top w:type="dxa" w:w="70"/>
-              <w:left w:type="dxa" w:w="110"/>
-              <w:bottom w:type="dxa" w:w="70"/>
-              <w:right w:type="dxa" w:w="110"/>
-            </w:tcMar>
-          </w:tcPr>
-          <w:p>
-            <w:pPr>
-              <w:keepNext/>
-              <w:keepLines/>
-              <w:spacing w:after="40" w:line="252"/>
-              <w:jc w:val="left"/>
-            </w:pPr>
-            <w:r>
-              <w:rPr>
-                <w:b/>
-                <w:bCs/>
-                <w:color w:val="FFFFFF"/>
-                <w:sz w:val="18"/>
-                <w:szCs w:val="18"/>
-              </w:rPr>
-              <w:t xml:space="preserve">Avaliação</w:t>
-            </w:r>
-          </w:p>
-        </w:tc>
-      </w:tr>
-      <w:tr>
-        <w:trPr>
-          <w:cantSplit/>
-        </w:trPr>
-        <w:tc>
-          <w:tcPr>
-            <w:tcW w:type="dxa" w:w="1734"/>
-            <w:tcBorders>
-              <w:top w:val="single" w:color="D5DDE8" w:sz="4"/>
-              <w:left w:val="single" w:color="D5DDE8" w:sz="4"/>
-              <w:bottom w:val="single" w:color="D5DDE8" w:sz="4"/>
-              <w:right w:val="single" w:color="D5DDE8" w:sz="4"/>
-            </w:tcBorders>
-            <w:tcMar>
-              <w:top w:type="dxa" w:w="70"/>
-              <w:left w:type="dxa" w:w="110"/>
-              <w:bottom w:type="dxa" w:w="70"/>
-              <w:right w:type="dxa" w:w="110"/>
-            </w:tcMar>
-          </w:tcPr>
-          <w:p>
-            <w:pPr>
-              <w:keepNext/>
-              <w:keepLines/>
-              <w:spacing w:after="40" w:line="252"/>
-              <w:jc w:val="left"/>
-            </w:pPr>
-            <w:r>
-              <w:rPr>
-                <w:sz w:val="19"/>
-                <w:szCs w:val="19"/>
-              </w:rPr>
-              <w:t xml:space="preserve">Técnica</w:t>
-            </w:r>
-          </w:p>
-        </w:tc>
-        <w:tc>
-          <w:tcPr>
-            <w:tcW w:type="dxa" w:w="7904"/>
-            <w:tcBorders>
-              <w:top w:val="single" w:color="D5DDE8" w:sz="4"/>
-              <w:left w:val="single" w:color="D5DDE8" w:sz="4"/>
-              <w:bottom w:val="single" w:color="D5DDE8" w:sz="4"/>
-              <w:right w:val="single" w:color="D5DDE8" w:sz="4"/>
-            </w:tcBorders>
-            <w:tcMar>
-              <w:top w:type="dxa" w:w="70"/>
-              <w:left w:type="dxa" w:w="110"/>
-              <w:bottom w:type="dxa" w:w="70"/>
-              <w:right w:type="dxa" w:w="110"/>
-            </w:tcMar>
-          </w:tcPr>
-          <w:p>
-            <w:pPr>
-              <w:keepNext/>
-              <w:keepLines/>
-              <w:spacing w:after="40" w:line="252"/>
-              <w:jc w:val="left"/>
-            </w:pPr>
-            <w:r>
-              <w:rPr>
-                <w:b/>
-                <w:bCs/>
-                <w:sz w:val="19"/>
-                <w:szCs w:val="19"/>
-              </w:rPr>
-              <w:t xml:space="preserve">Viável.</w:t>
-            </w:r>
-            <w:r>
-              <w:rPr>
-                <w:sz w:val="19"/>
-                <w:szCs w:val="19"/>
-              </w:rPr>
-              <w:t xml:space="preserve"> O produto funciona de ponta a ponta, com 239 testes automatizados e verificações reais de segurança e de rede</w:t>
-            </w:r>
-          </w:p>
-        </w:tc>
-      </w:tr>
-      <w:tr>
-        <w:trPr>
-          <w:cantSplit/>
-        </w:trPr>
-        <w:tc>
-          <w:tcPr>
-            <w:tcW w:type="dxa" w:w="1734"/>
-            <w:tcBorders>
-              <w:top w:val="single" w:color="D5DDE8" w:sz="4"/>
-              <w:left w:val="single" w:color="D5DDE8" w:sz="4"/>
-              <w:bottom w:val="single" w:color="D5DDE8" w:sz="4"/>
-              <w:right w:val="single" w:color="D5DDE8" w:sz="4"/>
-            </w:tcBorders>
-            <w:shd w:fill="F6F9FE" w:color="auto" w:val="clear"/>
-            <w:tcMar>
-              <w:top w:type="dxa" w:w="70"/>
-              <w:left w:type="dxa" w:w="110"/>
-              <w:bottom w:type="dxa" w:w="70"/>
-              <w:right w:type="dxa" w:w="110"/>
-            </w:tcMar>
-          </w:tcPr>
-          <w:p>
-            <w:pPr>
-              <w:keepNext/>
-              <w:keepLines/>
-              <w:spacing w:after="40" w:line="252"/>
-              <w:jc w:val="left"/>
-            </w:pPr>
-            <w:r>
-              <w:rPr>
-                <w:sz w:val="19"/>
-                <w:szCs w:val="19"/>
-              </w:rPr>
-              <w:t xml:space="preserve">Econômica</w:t>
-            </w:r>
-          </w:p>
-        </w:tc>
-        <w:tc>
-          <w:tcPr>
-            <w:tcW w:type="dxa" w:w="7904"/>
-            <w:tcBorders>
-              <w:top w:val="single" w:color="D5DDE8" w:sz="4"/>
-              <w:left w:val="single" w:color="D5DDE8" w:sz="4"/>
-              <w:bottom w:val="single" w:color="D5DDE8" w:sz="4"/>
-              <w:right w:val="single" w:color="D5DDE8" w:sz="4"/>
-            </w:tcBorders>
-            <w:shd w:fill="F6F9FE" w:color="auto" w:val="clear"/>
-            <w:tcMar>
-              <w:top w:type="dxa" w:w="70"/>
-              <w:left w:type="dxa" w:w="110"/>
-              <w:bottom w:type="dxa" w:w="70"/>
-              <w:right w:type="dxa" w:w="110"/>
-            </w:tcMar>
-          </w:tcPr>
-          <w:p>
-            <w:pPr>
-              <w:keepNext/>
-              <w:keepLines/>
-              <w:spacing w:after="40" w:line="252"/>
-              <w:jc w:val="left"/>
-            </w:pPr>
-            <w:r>
-              <w:rPr>
-                <w:b/>
-                <w:bCs/>
-                <w:sz w:val="19"/>
-                <w:szCs w:val="19"/>
-              </w:rPr>
-              <w:t xml:space="preserve">Viável.</w:t>
-            </w:r>
-            <w:r>
-              <w:rPr>
-                <w:sz w:val="19"/>
-                <w:szCs w:val="19"/>
-              </w:rPr>
-              <w:t xml:space="preserve"> Desenvolvimento na casa de R$ 200 mil e operação de poucos milhares por mês</w:t>
-            </w:r>
-          </w:p>
-        </w:tc>
-      </w:tr>
-      <w:tr>
-        <w:trPr>
-          <w:cantSplit/>
-        </w:trPr>
-        <w:tc>
-          <w:tcPr>
-            <w:tcW w:type="dxa" w:w="1734"/>
-            <w:tcBorders>
-              <w:top w:val="single" w:color="D5DDE8" w:sz="4"/>
-              <w:left w:val="single" w:color="D5DDE8" w:sz="4"/>
-              <w:bottom w:val="single" w:color="D5DDE8" w:sz="4"/>
-              <w:right w:val="single" w:color="D5DDE8" w:sz="4"/>
-            </w:tcBorders>
-            <w:tcMar>
-              <w:top w:type="dxa" w:w="70"/>
-              <w:left w:type="dxa" w:w="110"/>
-              <w:bottom w:type="dxa" w:w="70"/>
-              <w:right w:type="dxa" w:w="110"/>
-            </w:tcMar>
-          </w:tcPr>
-          <w:p>
-            <w:pPr>
-              <w:keepNext/>
-              <w:keepLines/>
-              <w:spacing w:after="40" w:line="252"/>
-              <w:jc w:val="left"/>
-            </w:pPr>
-            <w:r>
-              <w:rPr>
-                <w:sz w:val="19"/>
-                <w:szCs w:val="19"/>
-              </w:rPr>
-              <w:t xml:space="preserve">Legal</w:t>
-            </w:r>
-          </w:p>
-        </w:tc>
-        <w:tc>
-          <w:tcPr>
-            <w:tcW w:type="dxa" w:w="7904"/>
-            <w:tcBorders>
-              <w:top w:val="single" w:color="D5DDE8" w:sz="4"/>
-              <w:left w:val="single" w:color="D5DDE8" w:sz="4"/>
-              <w:bottom w:val="single" w:color="D5DDE8" w:sz="4"/>
-              <w:right w:val="single" w:color="D5DDE8" w:sz="4"/>
-            </w:tcBorders>
-            <w:tcMar>
-              <w:top w:type="dxa" w:w="70"/>
-              <w:left w:type="dxa" w:w="110"/>
-              <w:bottom w:type="dxa" w:w="70"/>
-              <w:right w:type="dxa" w:w="110"/>
-            </w:tcMar>
-          </w:tcPr>
-          <w:p>
-            <w:pPr>
-              <w:keepNext/>
-              <w:keepLines/>
-              <w:spacing w:after="40" w:line="252"/>
-              <w:jc w:val="left"/>
-            </w:pPr>
-            <w:r>
-              <w:rPr>
-                <w:b/>
-                <w:bCs/>
-                <w:sz w:val="19"/>
-                <w:szCs w:val="19"/>
-              </w:rPr>
-              <w:t xml:space="preserve">Viável com cuidado.</w:t>
-            </w:r>
-            <w:r>
-              <w:rPr>
-                <w:sz w:val="19"/>
-                <w:szCs w:val="19"/>
-              </w:rPr>
-              <w:t xml:space="preserve"> Desenhado para a LGPD; precisa de relatório de impacto (RIPD) e de base legal formal no órgão que o adotar</w:t>
-            </w:r>
-          </w:p>
-        </w:tc>
-      </w:tr>
-      <w:tr>
-        <w:trPr>
-          <w:cantSplit/>
-        </w:trPr>
-        <w:tc>
-          <w:tcPr>
-            <w:tcW w:type="dxa" w:w="1734"/>
-            <w:tcBorders>
-              <w:top w:val="single" w:color="D5DDE8" w:sz="4"/>
-              <w:left w:val="single" w:color="D5DDE8" w:sz="4"/>
-              <w:bottom w:val="single" w:color="D5DDE8" w:sz="4"/>
-              <w:right w:val="single" w:color="D5DDE8" w:sz="4"/>
-            </w:tcBorders>
-            <w:shd w:fill="F6F9FE" w:color="auto" w:val="clear"/>
-            <w:tcMar>
-              <w:top w:type="dxa" w:w="70"/>
-              <w:left w:type="dxa" w:w="110"/>
-              <w:bottom w:type="dxa" w:w="70"/>
-              <w:right w:type="dxa" w:w="110"/>
-            </w:tcMar>
-          </w:tcPr>
-          <w:p>
-            <w:pPr>
-              <w:keepNext/>
-              <w:keepLines/>
-              <w:spacing w:after="40" w:line="252"/>
-              <w:jc w:val="left"/>
-            </w:pPr>
-            <w:r>
-              <w:rPr>
-                <w:sz w:val="19"/>
-                <w:szCs w:val="19"/>
-              </w:rPr>
-              <w:t xml:space="preserve">Institucional</w:t>
-            </w:r>
-          </w:p>
-        </w:tc>
-        <w:tc>
-          <w:tcPr>
-            <w:tcW w:type="dxa" w:w="7904"/>
-            <w:tcBorders>
-              <w:top w:val="single" w:color="D5DDE8" w:sz="4"/>
-              <w:left w:val="single" w:color="D5DDE8" w:sz="4"/>
-              <w:bottom w:val="single" w:color="D5DDE8" w:sz="4"/>
-              <w:right w:val="single" w:color="D5DDE8" w:sz="4"/>
-            </w:tcBorders>
-            <w:shd w:fill="F6F9FE" w:color="auto" w:val="clear"/>
-            <w:tcMar>
-              <w:top w:type="dxa" w:w="70"/>
-              <w:left w:type="dxa" w:w="110"/>
-              <w:bottom w:type="dxa" w:w="70"/>
-              <w:right w:type="dxa" w:w="110"/>
-            </w:tcMar>
-          </w:tcPr>
-          <w:p>
-            <w:pPr>
-              <w:keepNext/>
-              <w:keepLines/>
-              <w:spacing w:after="40" w:line="252"/>
-              <w:jc w:val="left"/>
-            </w:pPr>
-            <w:r>
-              <w:rPr>
-                <w:b/>
-                <w:bCs/>
-                <w:sz w:val="19"/>
-                <w:szCs w:val="19"/>
-              </w:rPr>
-              <w:t xml:space="preserve">Depende de parceria.</w:t>
-            </w:r>
-            <w:r>
-              <w:rPr>
-                <w:sz w:val="19"/>
-                <w:szCs w:val="19"/>
-              </w:rPr>
-              <w:t xml:space="preserve"> Precisa de um órgão dono do serviço, de integração com a rede de proteção e, para a blockchain, de adesão à RBB</w:t>
-            </w:r>
-          </w:p>
-        </w:tc>
-      </w:tr>
-      <w:tr>
-        <w:trPr>
-          <w:cantSplit/>
-        </w:trPr>
-        <w:tc>
-          <w:tcPr>
-            <w:tcW w:type="dxa" w:w="1734"/>
-            <w:tcBorders>
-              <w:top w:val="single" w:color="D5DDE8" w:sz="4"/>
-              <w:left w:val="single" w:color="D5DDE8" w:sz="4"/>
-              <w:bottom w:val="single" w:color="D5DDE8" w:sz="4"/>
-              <w:right w:val="single" w:color="D5DDE8" w:sz="4"/>
-            </w:tcBorders>
-            <w:tcMar>
-              <w:top w:type="dxa" w:w="70"/>
-              <w:left w:type="dxa" w:w="110"/>
-              <w:bottom w:type="dxa" w:w="70"/>
-              <w:right w:type="dxa" w:w="110"/>
-            </w:tcMar>
-          </w:tcPr>
-          <w:p>
-            <w:pPr>
-              <w:keepNext w:val="false"/>
-              <w:keepLines/>
-              <w:spacing w:after="40" w:line="252"/>
-              <w:jc w:val="left"/>
-            </w:pPr>
-            <w:r>
-              <w:rPr>
-                <w:sz w:val="19"/>
-                <w:szCs w:val="19"/>
-              </w:rPr>
-              <w:t xml:space="preserve">Operacional</w:t>
-            </w:r>
-          </w:p>
-        </w:tc>
-        <w:tc>
-          <w:tcPr>
-            <w:tcW w:type="dxa" w:w="7904"/>
-            <w:tcBorders>
-              <w:top w:val="single" w:color="D5DDE8" w:sz="4"/>
-              <w:left w:val="single" w:color="D5DDE8" w:sz="4"/>
-              <w:bottom w:val="single" w:color="D5DDE8" w:sz="4"/>
-              <w:right w:val="single" w:color="D5DDE8" w:sz="4"/>
-            </w:tcBorders>
-            <w:tcMar>
-              <w:top w:type="dxa" w:w="70"/>
-              <w:left w:type="dxa" w:w="110"/>
-              <w:bottom w:type="dxa" w:w="70"/>
-              <w:right w:type="dxa" w:w="110"/>
-            </w:tcMar>
-          </w:tcPr>
-          <w:p>
-            <w:pPr>
-              <w:keepNext w:val="false"/>
-              <w:keepLines/>
-              <w:spacing w:after="40" w:line="252"/>
-              <w:jc w:val="left"/>
-            </w:pPr>
-            <w:r>
-              <w:rPr>
-                <w:b/>
-                <w:bCs/>
-                <w:sz w:val="19"/>
-                <w:szCs w:val="19"/>
-              </w:rPr>
-              <w:t xml:space="preserve">Depende de equipe.</w:t>
-            </w:r>
-            <w:r>
-              <w:rPr>
-                <w:sz w:val="19"/>
-                <w:szCs w:val="19"/>
-              </w:rPr>
-              <w:t xml:space="preserve"> O sistema prioriza e mede, mas quem atende são pessoas, e a análise mostra que são necessárias mais do que as previstas</w:t>
-            </w:r>
-          </w:p>
-        </w:tc>
-      </w:tr>
-    </w:tbl>
-    <w:p>
-      <w:pPr>
-        <w:spacing w:after="160" w:line="120"/>
-      </w:pPr>
     </w:p>
     <w:tbl>
       <w:tblPr>
@@ -18910,7 +18826,7 @@
         <w:spacing w:after="80" w:line="276"/>
         <w:jc w:val="left"/>
       </w:pPr>
-      <w:hyperlink w:history="1" r:id="rIdg9inoo8w_-rvkpfgzgaww">
+      <w:hyperlink w:history="1" r:id="rIddkvrwtdak7fr4jfmodefc">
         <w:r>
           <w:rPr>
             <w:rStyle w:val="Hyperlink"/>
@@ -19016,7 +18932,7 @@
         <w:spacing w:after="80" w:line="276"/>
         <w:jc w:val="left"/>
       </w:pPr>
-      <w:hyperlink w:history="1" r:id="rIdyri2ogv6-kucywrji5rsj">
+      <w:hyperlink w:history="1" r:id="rId6u1bye1luf64yrv7ka9kd">
         <w:r>
           <w:rPr>
             <w:rStyle w:val="Hyperlink"/>

</xml_diff>

<commit_message>
Documentos: telas do sistema (Anexo D e secao 2.4 do EC) e provas automaticas no GitHub Actions
</commit_message>
<xml_diff>
--- a/docs/Protege_Mais_EC_Atividade5_Relatorio_Final.docx
+++ b/docs/Protege_Mais_EC_Atividade5_Relatorio_Final.docx
@@ -1820,6 +1820,33 @@
         <w:tabs>
           <w:tab w:val="right" w:pos="9638" w:leader="dot"/>
         </w:tabs>
+        <w:spacing w:before="0" w:after="0" w:line="252"/>
+        <w:ind w:left="400"/>
+      </w:pPr>
+      <w:r>
+        <w:rPr>
+          <w:b w:val="false"/>
+          <w:bCs w:val="false"/>
+          <w:color w:val="334155"/>
+          <w:sz w:val="18"/>
+          <w:szCs w:val="18"/>
+        </w:rPr>
+        <w:t xml:space="preserve">2.4 O produto em telas</w:t>
+      </w:r>
+      <w:r>
+        <w:rPr>
+          <w:color w:val="334155"/>
+          <w:sz w:val="18"/>
+          <w:szCs w:val="18"/>
+        </w:rPr>
+        <w:t xml:space="preserve">	11</w:t>
+      </w:r>
+    </w:p>
+    <w:p>
+      <w:pPr>
+        <w:tabs>
+          <w:tab w:val="right" w:pos="9638" w:leader="dot"/>
+        </w:tabs>
         <w:spacing w:before="90" w:after="0" w:line="252"/>
         <w:ind w:left="0"/>
       </w:pPr>
@@ -1839,7 +1866,7 @@
           <w:sz w:val="18"/>
           <w:szCs w:val="18"/>
         </w:rPr>
-        <w:t xml:space="preserve">	12</w:t>
+        <w:t xml:space="preserve">	14</w:t>
       </w:r>
     </w:p>
     <w:p>
@@ -1866,7 +1893,7 @@
           <w:sz w:val="18"/>
           <w:szCs w:val="18"/>
         </w:rPr>
-        <w:t xml:space="preserve">	12</w:t>
+        <w:t xml:space="preserve">	14</w:t>
       </w:r>
     </w:p>
     <w:p>
@@ -1893,7 +1920,7 @@
           <w:sz w:val="18"/>
           <w:szCs w:val="18"/>
         </w:rPr>
-        <w:t xml:space="preserve">	12</w:t>
+        <w:t xml:space="preserve">	14</w:t>
       </w:r>
     </w:p>
     <w:p>
@@ -1920,7 +1947,7 @@
           <w:sz w:val="18"/>
           <w:szCs w:val="18"/>
         </w:rPr>
-        <w:t xml:space="preserve">	12</w:t>
+        <w:t xml:space="preserve">	14</w:t>
       </w:r>
     </w:p>
     <w:p>
@@ -1947,7 +1974,7 @@
           <w:sz w:val="18"/>
           <w:szCs w:val="18"/>
         </w:rPr>
-        <w:t xml:space="preserve">	16</w:t>
+        <w:t xml:space="preserve">	18</w:t>
       </w:r>
     </w:p>
     <w:p>
@@ -1974,7 +2001,7 @@
           <w:sz w:val="18"/>
           <w:szCs w:val="18"/>
         </w:rPr>
-        <w:t xml:space="preserve">	17</w:t>
+        <w:t xml:space="preserve">	19</w:t>
       </w:r>
     </w:p>
     <w:p>
@@ -2001,7 +2028,7 @@
           <w:sz w:val="18"/>
           <w:szCs w:val="18"/>
         </w:rPr>
-        <w:t xml:space="preserve">	17</w:t>
+        <w:t xml:space="preserve">	19</w:t>
       </w:r>
     </w:p>
     <w:p>
@@ -2028,7 +2055,7 @@
           <w:sz w:val="18"/>
           <w:szCs w:val="18"/>
         </w:rPr>
-        <w:t xml:space="preserve">	17</w:t>
+        <w:t xml:space="preserve">	19</w:t>
       </w:r>
     </w:p>
     <w:p>
@@ -2055,7 +2082,7 @@
           <w:sz w:val="18"/>
           <w:szCs w:val="18"/>
         </w:rPr>
-        <w:t xml:space="preserve">	17</w:t>
+        <w:t xml:space="preserve">	19</w:t>
       </w:r>
     </w:p>
     <w:p>
@@ -2082,7 +2109,7 @@
           <w:sz w:val="18"/>
           <w:szCs w:val="18"/>
         </w:rPr>
-        <w:t xml:space="preserve">	18</w:t>
+        <w:t xml:space="preserve">	20</w:t>
       </w:r>
     </w:p>
     <w:p>
@@ -7744,7 +7771,7 @@
                 <w:sz w:val="17"/>
                 <w:szCs w:val="17"/>
               </w:rPr>
-              <w:t xml:space="preserve">Git e GitHub, GitHub Pages, Maven, npm, Mermaid e Graphviz (diagramas), assistente de IA (Claude) para revisão de código, testes e documentação</w:t>
+              <w:t xml:space="preserve">Git e GitHub, GitHub Pages, GitHub Actions (testes e provas a cada push), Maven, npm, Mermaid e Graphviz (diagramas), assistente de IA (Claude) para revisão de código, testes e documentação</w:t>
             </w:r>
           </w:p>
         </w:tc>
@@ -11279,6 +11306,367 @@
     </w:p>
     <w:p>
       <w:pPr>
+        <w:pStyle w:val="Heading2"/>
+        <w:keepNext/>
+        <w:pBdr>
+          <w:bottom w:val="single" w:color="0E7C8C" w:sz="6" w:space="3"/>
+        </w:pBdr>
+      </w:pPr>
+      <w:r>
+        <w:rPr>
+          <w:color w:val="0E7C8C"/>
+          <w:sz w:val="22"/>
+          <w:szCs w:val="22"/>
+          <w:rFonts w:ascii="Segoe UI Symbol" w:cs="Segoe UI Symbol" w:eastAsia="Segoe UI Symbol" w:hAnsi="Segoe UI Symbol"/>
+        </w:rPr>
+        <w:t xml:space="preserve">■ </w:t>
+      </w:r>
+      <w:r>
+        <w:rPr>
+          <w:color w:val="0A5561"/>
+        </w:rPr>
+        <w:t xml:space="preserve">2.4 O produto em telas</w:t>
+      </w:r>
+    </w:p>
+    <w:p>
+      <w:pPr>
+        <w:spacing w:after="140" w:before="0" w:line="288"/>
+        <w:jc w:val="both"/>
+      </w:pPr>
+      <w:r>
+        <w:t xml:space="preserve">As telas abaixo foram capturadas com o sistema completo no ar (API Java e site), sobre a base de demonstração. Elas mostram os dois lados do produto: o canal da cidadã e o painel do órgão.</w:t>
+      </w:r>
+    </w:p>
+    <w:p>
+      <w:pPr>
+        <w:keepNext/>
+        <w:spacing w:before="120" w:after="60"/>
+        <w:jc w:val="center"/>
+      </w:pPr>
+      <w:r>
+        <w:drawing>
+          <wp:inline distT="0" distB="0" distL="0" distR="0">
+            <wp:extent cx="5400675" cy="3638550"/>
+            <wp:effectExtent t="0" r="0" b="0" l="0"/>
+            <wp:docPr id="1" name="fig5" descr="Portal da cidadã: denúncia sem login, com o botão de saída rápida sempre no topo." title="Portal da cidadã: denúncia sem login, com o botão de saída rápida sempre no topo."/>
+            <wp:cNvGraphicFramePr>
+              <a:graphicFrameLocks xmlns:a="http://schemas.openxmlformats.org/drawingml/2006/main" noChangeAspect="1"/>
+            </wp:cNvGraphicFramePr>
+            <a:graphic xmlns:a="http://schemas.openxmlformats.org/drawingml/2006/main">
+              <a:graphicData uri="http://schemas.openxmlformats.org/drawingml/2006/picture">
+                <pic:pic xmlns:pic="http://schemas.openxmlformats.org/drawingml/2006/picture">
+                  <pic:nvPicPr>
+                    <pic:cNvPr id="0" name="" descr=""/>
+                    <pic:cNvPicPr>
+                      <a:picLocks noChangeAspect="1" noChangeArrowheads="1"/>
+                    </pic:cNvPicPr>
+                  </pic:nvPicPr>
+                  <pic:blipFill>
+                    <a:blip r:embed="rId12" cstate="none"/>
+                    <a:srcRect/>
+                    <a:stretch>
+                      <a:fillRect/>
+                    </a:stretch>
+                  </pic:blipFill>
+                  <pic:spPr bwMode="auto">
+                    <a:xfrm>
+                      <a:off x="0" y="0"/>
+                      <a:ext cx="5400675" cy="3638550"/>
+                    </a:xfrm>
+                    <a:prstGeom prst="rect">
+                      <a:avLst/>
+                    </a:prstGeom>
+                  </pic:spPr>
+                </pic:pic>
+              </a:graphicData>
+            </a:graphic>
+          </wp:inline>
+        </w:drawing>
+      </w:r>
+    </w:p>
+    <w:p>
+      <w:pPr>
+        <w:spacing w:after="200"/>
+        <w:jc w:val="center"/>
+      </w:pPr>
+      <w:r>
+        <w:rPr>
+          <w:color w:val="0E7C8C"/>
+          <w:sz w:val="14"/>
+          <w:szCs w:val="14"/>
+          <w:rFonts w:ascii="Segoe UI Symbol" w:cs="Segoe UI Symbol" w:eastAsia="Segoe UI Symbol" w:hAnsi="Segoe UI Symbol"/>
+        </w:rPr>
+        <w:t xml:space="preserve">▲ </w:t>
+      </w:r>
+      <w:r>
+        <w:rPr>
+          <w:b/>
+          <w:bCs/>
+          <w:color w:val="0E7C8C"/>
+          <w:sz w:val="18"/>
+          <w:szCs w:val="18"/>
+        </w:rPr>
+        <w:t xml:space="preserve">Figura 5. </w:t>
+      </w:r>
+      <w:r>
+        <w:rPr>
+          <w:i/>
+          <w:iCs/>
+          <w:color w:val="475569"/>
+          <w:sz w:val="18"/>
+          <w:szCs w:val="18"/>
+        </w:rPr>
+        <w:t xml:space="preserve">Portal da cidadã: denúncia sem login, com o botão de saída rápida sempre no topo.</w:t>
+      </w:r>
+    </w:p>
+    <w:p>
+      <w:pPr>
+        <w:keepNext/>
+        <w:spacing w:before="120" w:after="60"/>
+        <w:jc w:val="center"/>
+      </w:pPr>
+      <w:r>
+        <w:drawing>
+          <wp:inline distT="0" distB="0" distL="0" distR="0">
+            <wp:extent cx="5400675" cy="3638550"/>
+            <wp:effectExtent t="0" r="0" b="0" l="0"/>
+            <wp:docPr id="1" name="fig6" descr="Formulário: os três níveis de anonimato, com o que se ganha e o que se perde em cada um." title="Formulário: os três níveis de anonimato, com o que se ganha e o que se perde em cada um."/>
+            <wp:cNvGraphicFramePr>
+              <a:graphicFrameLocks xmlns:a="http://schemas.openxmlformats.org/drawingml/2006/main" noChangeAspect="1"/>
+            </wp:cNvGraphicFramePr>
+            <a:graphic xmlns:a="http://schemas.openxmlformats.org/drawingml/2006/main">
+              <a:graphicData uri="http://schemas.openxmlformats.org/drawingml/2006/picture">
+                <pic:pic xmlns:pic="http://schemas.openxmlformats.org/drawingml/2006/picture">
+                  <pic:nvPicPr>
+                    <pic:cNvPr id="0" name="" descr=""/>
+                    <pic:cNvPicPr>
+                      <a:picLocks noChangeAspect="1" noChangeArrowheads="1"/>
+                    </pic:cNvPicPr>
+                  </pic:nvPicPr>
+                  <pic:blipFill>
+                    <a:blip r:embed="rId13" cstate="none"/>
+                    <a:srcRect/>
+                    <a:stretch>
+                      <a:fillRect/>
+                    </a:stretch>
+                  </pic:blipFill>
+                  <pic:spPr bwMode="auto">
+                    <a:xfrm>
+                      <a:off x="0" y="0"/>
+                      <a:ext cx="5400675" cy="3638550"/>
+                    </a:xfrm>
+                    <a:prstGeom prst="rect">
+                      <a:avLst/>
+                    </a:prstGeom>
+                  </pic:spPr>
+                </pic:pic>
+              </a:graphicData>
+            </a:graphic>
+          </wp:inline>
+        </w:drawing>
+      </w:r>
+    </w:p>
+    <w:p>
+      <w:pPr>
+        <w:spacing w:after="200"/>
+        <w:jc w:val="center"/>
+      </w:pPr>
+      <w:r>
+        <w:rPr>
+          <w:color w:val="0E7C8C"/>
+          <w:sz w:val="14"/>
+          <w:szCs w:val="14"/>
+          <w:rFonts w:ascii="Segoe UI Symbol" w:cs="Segoe UI Symbol" w:eastAsia="Segoe UI Symbol" w:hAnsi="Segoe UI Symbol"/>
+        </w:rPr>
+        <w:t xml:space="preserve">▲ </w:t>
+      </w:r>
+      <w:r>
+        <w:rPr>
+          <w:b/>
+          <w:bCs/>
+          <w:color w:val="0E7C8C"/>
+          <w:sz w:val="18"/>
+          <w:szCs w:val="18"/>
+        </w:rPr>
+        <w:t xml:space="preserve">Figura 6. </w:t>
+      </w:r>
+      <w:r>
+        <w:rPr>
+          <w:i/>
+          <w:iCs/>
+          <w:color w:val="475569"/>
+          <w:sz w:val="18"/>
+          <w:szCs w:val="18"/>
+        </w:rPr>
+        <w:t xml:space="preserve">Formulário: os três níveis de anonimato, com o que se ganha e o que se perde em cada um.</w:t>
+      </w:r>
+    </w:p>
+    <w:p>
+      <w:pPr>
+        <w:keepNext/>
+        <w:spacing w:before="120" w:after="60"/>
+        <w:jc w:val="center"/>
+      </w:pPr>
+      <w:r>
+        <w:drawing>
+          <wp:inline distT="0" distB="0" distL="0" distR="0">
+            <wp:extent cx="5400675" cy="3638550"/>
+            <wp:effectExtent t="0" r="0" b="0" l="0"/>
+            <wp:docPr id="1" name="fig7" descr="Painel do órgão: indicadores e recomendações do VigIA, sem enviar relato à IA." title="Painel do órgão: indicadores e recomendações do VigIA, sem enviar relato à IA."/>
+            <wp:cNvGraphicFramePr>
+              <a:graphicFrameLocks xmlns:a="http://schemas.openxmlformats.org/drawingml/2006/main" noChangeAspect="1"/>
+            </wp:cNvGraphicFramePr>
+            <a:graphic xmlns:a="http://schemas.openxmlformats.org/drawingml/2006/main">
+              <a:graphicData uri="http://schemas.openxmlformats.org/drawingml/2006/picture">
+                <pic:pic xmlns:pic="http://schemas.openxmlformats.org/drawingml/2006/picture">
+                  <pic:nvPicPr>
+                    <pic:cNvPr id="0" name="" descr=""/>
+                    <pic:cNvPicPr>
+                      <a:picLocks noChangeAspect="1" noChangeArrowheads="1"/>
+                    </pic:cNvPicPr>
+                  </pic:nvPicPr>
+                  <pic:blipFill>
+                    <a:blip r:embed="rId14" cstate="none"/>
+                    <a:srcRect/>
+                    <a:stretch>
+                      <a:fillRect/>
+                    </a:stretch>
+                  </pic:blipFill>
+                  <pic:spPr bwMode="auto">
+                    <a:xfrm>
+                      <a:off x="0" y="0"/>
+                      <a:ext cx="5400675" cy="3638550"/>
+                    </a:xfrm>
+                    <a:prstGeom prst="rect">
+                      <a:avLst/>
+                    </a:prstGeom>
+                  </pic:spPr>
+                </pic:pic>
+              </a:graphicData>
+            </a:graphic>
+          </wp:inline>
+        </w:drawing>
+      </w:r>
+    </w:p>
+    <w:p>
+      <w:pPr>
+        <w:spacing w:after="200"/>
+        <w:jc w:val="center"/>
+      </w:pPr>
+      <w:r>
+        <w:rPr>
+          <w:color w:val="0E7C8C"/>
+          <w:sz w:val="14"/>
+          <w:szCs w:val="14"/>
+          <w:rFonts w:ascii="Segoe UI Symbol" w:cs="Segoe UI Symbol" w:eastAsia="Segoe UI Symbol" w:hAnsi="Segoe UI Symbol"/>
+        </w:rPr>
+        <w:t xml:space="preserve">▲ </w:t>
+      </w:r>
+      <w:r>
+        <w:rPr>
+          <w:b/>
+          <w:bCs/>
+          <w:color w:val="0E7C8C"/>
+          <w:sz w:val="18"/>
+          <w:szCs w:val="18"/>
+        </w:rPr>
+        <w:t xml:space="preserve">Figura 7. </w:t>
+      </w:r>
+      <w:r>
+        <w:rPr>
+          <w:i/>
+          <w:iCs/>
+          <w:color w:val="475569"/>
+          <w:sz w:val="18"/>
+          <w:szCs w:val="18"/>
+        </w:rPr>
+        <w:t xml:space="preserve">Painel do órgão: indicadores e recomendações do VigIA, sem enviar relato à IA.</w:t>
+      </w:r>
+    </w:p>
+    <w:p>
+      <w:pPr>
+        <w:keepNext/>
+        <w:spacing w:before="120" w:after="60"/>
+        <w:jc w:val="center"/>
+      </w:pPr>
+      <w:r>
+        <w:drawing>
+          <wp:inline distT="0" distB="0" distL="0" distR="0">
+            <wp:extent cx="5400675" cy="3638550"/>
+            <wp:effectExtent t="0" r="0" b="0" l="0"/>
+            <wp:docPr id="1" name="fig8" descr="Trilha de auditoria: consultas sensíveis e recusas registradas, com a cadeia SHA-256 conferida." title="Trilha de auditoria: consultas sensíveis e recusas registradas, com a cadeia SHA-256 conferida."/>
+            <wp:cNvGraphicFramePr>
+              <a:graphicFrameLocks xmlns:a="http://schemas.openxmlformats.org/drawingml/2006/main" noChangeAspect="1"/>
+            </wp:cNvGraphicFramePr>
+            <a:graphic xmlns:a="http://schemas.openxmlformats.org/drawingml/2006/main">
+              <a:graphicData uri="http://schemas.openxmlformats.org/drawingml/2006/picture">
+                <pic:pic xmlns:pic="http://schemas.openxmlformats.org/drawingml/2006/picture">
+                  <pic:nvPicPr>
+                    <pic:cNvPr id="0" name="" descr=""/>
+                    <pic:cNvPicPr>
+                      <a:picLocks noChangeAspect="1" noChangeArrowheads="1"/>
+                    </pic:cNvPicPr>
+                  </pic:nvPicPr>
+                  <pic:blipFill>
+                    <a:blip r:embed="rId15" cstate="none"/>
+                    <a:srcRect/>
+                    <a:stretch>
+                      <a:fillRect/>
+                    </a:stretch>
+                  </pic:blipFill>
+                  <pic:spPr bwMode="auto">
+                    <a:xfrm>
+                      <a:off x="0" y="0"/>
+                      <a:ext cx="5400675" cy="3638550"/>
+                    </a:xfrm>
+                    <a:prstGeom prst="rect">
+                      <a:avLst/>
+                    </a:prstGeom>
+                  </pic:spPr>
+                </pic:pic>
+              </a:graphicData>
+            </a:graphic>
+          </wp:inline>
+        </w:drawing>
+      </w:r>
+    </w:p>
+    <w:p>
+      <w:pPr>
+        <w:spacing w:after="200"/>
+        <w:jc w:val="center"/>
+      </w:pPr>
+      <w:r>
+        <w:rPr>
+          <w:color w:val="0E7C8C"/>
+          <w:sz w:val="14"/>
+          <w:szCs w:val="14"/>
+          <w:rFonts w:ascii="Segoe UI Symbol" w:cs="Segoe UI Symbol" w:eastAsia="Segoe UI Symbol" w:hAnsi="Segoe UI Symbol"/>
+        </w:rPr>
+        <w:t xml:space="preserve">▲ </w:t>
+      </w:r>
+      <w:r>
+        <w:rPr>
+          <w:b/>
+          <w:bCs/>
+          <w:color w:val="0E7C8C"/>
+          <w:sz w:val="18"/>
+          <w:szCs w:val="18"/>
+        </w:rPr>
+        <w:t xml:space="preserve">Figura 8. </w:t>
+      </w:r>
+      <w:r>
+        <w:rPr>
+          <w:i/>
+          <w:iCs/>
+          <w:color w:val="475569"/>
+          <w:sz w:val="18"/>
+          <w:szCs w:val="18"/>
+        </w:rPr>
+        <w:t xml:space="preserve">Trilha de auditoria: consultas sensíveis e recusas registradas, com a cadeia SHA-256 conferida.</w:t>
+      </w:r>
+    </w:p>
+    <w:p>
+      <w:pPr>
         <w:pStyle w:val="Heading1"/>
         <w:keepNext/>
         <w:pageBreakBefore/>
@@ -15948,7 +16336,7 @@
           <wp:inline distT="0" distB="0" distL="0" distR="0">
             <wp:extent cx="5943600" cy="3057525"/>
             <wp:effectExtent t="0" r="0" b="0" l="0"/>
-            <wp:docPr id="1" name="fig5" descr="Custo de desenvolvimento por papel, do maior para o menor. O back-end Java concentra um terço do total." title="Custo de desenvolvimento por papel, do maior para o menor. O back-end Java concentra um terço do total."/>
+            <wp:docPr id="1" name="fig9" descr="Custo de desenvolvimento por papel, do maior para o menor. O back-end Java concentra um terço do total." title="Custo de desenvolvimento por papel, do maior para o menor. O back-end Java concentra um terço do total."/>
             <wp:cNvGraphicFramePr>
               <a:graphicFrameLocks xmlns:a="http://schemas.openxmlformats.org/drawingml/2006/main" noChangeAspect="1"/>
             </wp:cNvGraphicFramePr>
@@ -15962,7 +16350,7 @@
                     </pic:cNvPicPr>
                   </pic:nvPicPr>
                   <pic:blipFill>
-                    <a:blip r:embed="rId12" cstate="none"/>
+                    <a:blip r:embed="rId16" cstate="none"/>
                     <a:srcRect/>
                     <a:stretch>
                       <a:fillRect/>
@@ -16006,7 +16394,7 @@
           <w:sz w:val="18"/>
           <w:szCs w:val="18"/>
         </w:rPr>
-        <w:t xml:space="preserve">Figura 5. </w:t>
+        <w:t xml:space="preserve">Figura 9. </w:t>
       </w:r>
       <w:r>
         <w:rPr>
@@ -17579,7 +17967,7 @@
           <wp:inline distT="0" distB="0" distL="0" distR="0">
             <wp:extent cx="5943600" cy="2381250"/>
             <wp:effectExtent t="0" r="0" b="0" l="0"/>
-            <wp:docPr id="1" name="fig6" descr="Faixa mensal de cada item de operação. Banco com réplica e duas instâncias da API são os custos fixos." title="Faixa mensal de cada item de operação. Banco com réplica e duas instâncias da API são os custos fixos."/>
+            <wp:docPr id="1" name="fig10" descr="Faixa mensal de cada item de operação. Banco com réplica e duas instâncias da API são os custos fixos." title="Faixa mensal de cada item de operação. Banco com réplica e duas instâncias da API são os custos fixos."/>
             <wp:cNvGraphicFramePr>
               <a:graphicFrameLocks xmlns:a="http://schemas.openxmlformats.org/drawingml/2006/main" noChangeAspect="1"/>
             </wp:cNvGraphicFramePr>
@@ -17593,7 +17981,7 @@
                     </pic:cNvPicPr>
                   </pic:nvPicPr>
                   <pic:blipFill>
-                    <a:blip r:embed="rId13" cstate="none"/>
+                    <a:blip r:embed="rId17" cstate="none"/>
                     <a:srcRect/>
                     <a:stretch>
                       <a:fillRect/>
@@ -17637,7 +18025,7 @@
           <w:sz w:val="18"/>
           <w:szCs w:val="18"/>
         </w:rPr>
-        <w:t xml:space="preserve">Figura 6. </w:t>
+        <w:t xml:space="preserve">Figura 10. </w:t>
       </w:r>
       <w:r>
         <w:rPr>
@@ -18499,7 +18887,7 @@
           <wp:inline distT="0" distB="0" distL="0" distR="0">
             <wp:extent cx="5219700" cy="1390650"/>
             <wp:effectExtent t="0" r="0" b="0" l="0"/>
-            <wp:docPr id="1" name="fig7" descr="Viabilidade por dimensão. As duas que dependem de outros não se resolvem com código." title="Viabilidade por dimensão. As duas que dependem de outros não se resolvem com código."/>
+            <wp:docPr id="1" name="fig11" descr="Viabilidade por dimensão. As duas que dependem de outros não se resolvem com código." title="Viabilidade por dimensão. As duas que dependem de outros não se resolvem com código."/>
             <wp:cNvGraphicFramePr>
               <a:graphicFrameLocks xmlns:a="http://schemas.openxmlformats.org/drawingml/2006/main" noChangeAspect="1"/>
             </wp:cNvGraphicFramePr>
@@ -18513,7 +18901,7 @@
                     </pic:cNvPicPr>
                   </pic:nvPicPr>
                   <pic:blipFill>
-                    <a:blip r:embed="rId14" cstate="none"/>
+                    <a:blip r:embed="rId18" cstate="none"/>
                     <a:srcRect/>
                     <a:stretch>
                       <a:fillRect/>
@@ -18557,7 +18945,7 @@
           <w:sz w:val="18"/>
           <w:szCs w:val="18"/>
         </w:rPr>
-        <w:t xml:space="preserve">Figura 7. </w:t>
+        <w:t xml:space="preserve">Figura 11. </w:t>
       </w:r>
       <w:r>
         <w:rPr>
@@ -18826,7 +19214,7 @@
         <w:spacing w:after="80" w:line="276"/>
         <w:jc w:val="left"/>
       </w:pPr>
-      <w:hyperlink w:history="1" r:id="rIddkvrwtdak7fr4jfmodefc">
+      <w:hyperlink w:history="1" r:id="rIdxdfilarrxnnrco7ia68jb">
         <w:r>
           <w:rPr>
             <w:rStyle w:val="Hyperlink"/>
@@ -18932,7 +19320,7 @@
         <w:spacing w:after="80" w:line="276"/>
         <w:jc w:val="left"/>
       </w:pPr>
-      <w:hyperlink w:history="1" r:id="rId6u1bye1luf64yrv7ka9kd">
+      <w:hyperlink w:history="1" r:id="rIdxmzdnphvsyejrl7s9bkh2">
         <w:r>
           <w:rPr>
             <w:rStyle w:val="Hyperlink"/>

</xml_diff>

<commit_message>
Link do video da Fase 7 no README, no site e nos documentos
</commit_message>
<xml_diff>
--- a/docs/Protege_Mais_EC_Atividade5_Relatorio_Final.docx
+++ b/docs/Protege_Mais_EC_Atividade5_Relatorio_Final.docx
@@ -503,7 +503,7 @@
           <w:sz w:val="19"/>
           <w:szCs w:val="19"/>
         </w:rPr>
-        <w:t xml:space="preserve">youtu.be/XXXXXXXX (inserir após o upload)</w:t>
+        <w:t xml:space="preserve">youtu.be/ekdO6yj0FE4</w:t>
       </w:r>
     </w:p>
     <w:p>
@@ -1318,7 +1318,7 @@
                 <w:sz w:val="19"/>
                 <w:szCs w:val="19"/>
               </w:rPr>
-              <w:t xml:space="preserve">youtu.be/XXXXXXXX (inserir após o upload)</w:t>
+              <w:t xml:space="preserve">youtu.be/ekdO6yj0FE4</w:t>
             </w:r>
           </w:p>
         </w:tc>

</xml_diff>